<commit_message>
Simulation change with moment of inertia calculated with real rocket
</commit_message>
<xml_diff>
--- a/Documentation/TechnicalDoc/CID_RocketPower_Rev02.docx
+++ b/Documentation/TechnicalDoc/CID_RocketPower_Rev02.docx
@@ -38,18 +38,8 @@
         </w:rPr>
         <w:t>Document ID: CID-RocketPower-Avionics</w:t>
         <w:br/>
-      </w:r>
-      <w:r>
-        <w:rPr>
-          <w:sz w:val="22"/>
-        </w:rPr>
         <w:t>Prepared by: Anas Senouci</w:t>
         <w:br/>
-      </w:r>
-      <w:r>
-        <w:rPr>
-          <w:sz w:val="22"/>
-        </w:rPr>
         <w:t>Project: RocketPower Flight Computer</w:t>
         <w:br/>
       </w:r>
@@ -11000,6 +10990,66 @@
           </w:p>
         </w:tc>
       </w:tr>
+      <w:tr>
+        <w:tc>
+          <w:tcPr>
+            <w:tcW w:type="dxa" w:w="4320"/>
+          </w:tcPr>
+          <w:p>
+            <w:r/>
+            <w:r>
+              <w:rPr>
+                <w:sz w:val="19"/>
+              </w:rPr>
+              <w:t xml:space="preserve">Moment of inertia (I)</w:t>
+            </w:r>
+          </w:p>
+        </w:tc>
+        <w:tc>
+          <w:tcPr>
+            <w:tcW w:type="dxa" w:w="4320"/>
+          </w:tcPr>
+          <w:p>
+            <w:r/>
+            <w:r>
+              <w:rPr>
+                <w:sz w:val="19"/>
+              </w:rPr>
+              <w:t xml:space="preserve">Resistance to angular acceleration about an axis; pitch/yaw about the CG here</w:t>
+            </w:r>
+          </w:p>
+        </w:tc>
+      </w:tr>
+      <w:tr>
+        <w:tc>
+          <w:tcPr>
+            <w:tcW w:type="dxa" w:w="4320"/>
+          </w:tcPr>
+          <w:p>
+            <w:r/>
+            <w:r>
+              <w:rPr>
+                <w:sz w:val="19"/>
+              </w:rPr>
+              <w:t xml:space="preserve">Radius of gyration (k)</w:t>
+            </w:r>
+          </w:p>
+        </w:tc>
+        <w:tc>
+          <w:tcPr>
+            <w:tcW w:type="dxa" w:w="4320"/>
+          </w:tcPr>
+          <w:p>
+            <w:r/>
+            <w:r>
+              <w:rPr>
+                <w:sz w:val="19"/>
+              </w:rPr>
+              <w:t xml:space="preserve">Mass-independent length scale where I = m * k^2</w:t>
+            </w:r>
+          </w:p>
+        </w:tc>
+      </w:tr>
     </w:tbl>
     <w:p/>
     <w:p>
@@ -11114,7 +11164,7 @@
               <w:rPr>
                 <w:sz w:val="19"/>
               </w:rPr>
-              <w:t>Not yet recorded</w:t>
+              <w:t>Loaded recorded, 13.3; no-motor/burnout pending</w:t>
             </w:r>
           </w:p>
         </w:tc>
@@ -11161,7 +11211,7 @@
               <w:rPr>
                 <w:sz w:val="19"/>
               </w:rPr>
-              <w:t>First estimate recorded, 13.3</w:t>
+              <w:t>Two estimates recorded (disagree) -- see 13.5, 13.3</w:t>
             </w:r>
           </w:p>
         </w:tc>
@@ -11205,7 +11255,7 @@
               <w:rPr>
                 <w:sz w:val="19"/>
               </w:rPr>
-              <w:t>Not yet recorded</w:t>
+              <w:t>Loaded + no-motor recorded, 13.3; propellant/burnout pending, 13.4</w:t>
             </w:r>
           </w:p>
         </w:tc>
@@ -11222,7 +11272,7 @@
               <w:rPr>
                 <w:sz w:val="19"/>
               </w:rPr>
-              <w:t>Moments of inertia</w:t>
+              <w:t xml:space="preserve">Moments of inertia</w:t>
             </w:r>
           </w:p>
         </w:tc>
@@ -11237,7 +11287,7 @@
               <w:rPr>
                 <w:sz w:val="19"/>
               </w:rPr>
-              <w:t>Full 3D CAD assembly with real material densities</w:t>
+              <w:t xml:space="preserve">Bifilar pendulum (two-string torsional), measured on the assembled rocket -- 13.2.2</w:t>
             </w:r>
           </w:p>
         </w:tc>
@@ -11252,7 +11302,7 @@
               <w:rPr>
                 <w:sz w:val="19"/>
               </w:rPr>
-              <w:t>Not yet computed</w:t>
+              <w:t xml:space="preserve">Measured, pitch/yaw, loaded config only -- 13.3</w:t>
             </w:r>
           </w:p>
         </w:tc>
@@ -11274,6 +11324,32 @@
           <w:i/>
         </w:rPr>
         <w:t>Side-profile silhouette sketched in Fusion 360, extruded to a uniform 1mm thickness, assigned a placeholder material (Steel -- only to give Fusion a density to compute a centroid), then read Center of Mass. Uniform thickness/density makes that centroid equal to the 2D silhouette's area centroid -- the classic "cardboard cutout" CP approximation. First-order only: ignores nose/fin lift-curve-slope differences and Mach effects. Cross-check against a Barrowman calculation or OpenRocket/RASAero before finalizing stability margin.</w:t>
+      </w:r>
+    </w:p>
+    <w:p>
+      <w:pPr>
+        <w:pStyle w:val="Heading3"/>
+      </w:pPr>
+      <w:r>
+        <w:t xml:space="preserve">13.2.2 MOI Method: Bifilar Pendulum</w:t>
+      </w:r>
+    </w:p>
+    <w:p>
+      <w:r>
+        <w:rPr>
+          <w:b w:val="0"/>
+          <w:i w:val="0"/>
+        </w:rPr>
+        <w:t xml:space="preserve">Strings attached at 21 cm and 57 cm from the nose tip (CG +-18 cm), string separation d = 0.36 m; string length L = 1.70 m from a rigid overhead support, low-stretch string, girth hitches at attachment points; rocket hung level. Twisting a few degrees about the vertical axis and timing the torsional oscillation gives the moment of inertia -- the standard hobbyist bifilar-pendulum method. Measured LOADED (743 g, live motor installed). Raw data: 10 oscillations timed at 31 s -&gt; T = 3.1 s. Formula: I = m*g*T^2*d^2/(16*pi^2*L); radius of gyration k^2 = g*T^2*d^2/(16*pi^2*L).</w:t>
+      </w:r>
+    </w:p>
+    <w:p>
+      <w:r>
+        <w:rPr>
+          <w:b w:val="0"/>
+          <w:i w:val="0"/>
+        </w:rPr>
+        <w:t xml:space="preserve">With g = 9.81 m/s^2: k^2 = 0.0455 m^2, k = 0.213 m, I_pitch = 0.743 kg * 0.0455 m^2 = 0.0338 kg*m^2 (loaded). Validation: a uniform 75 cm rod has k = L/sqrt(12) = 0.217 m; the measured 0.213 m sits just below, consistent with mass slightly concentrated toward the center (motor aft, nose weight forward). Assumes small-angle twist, equal/parallel strings, and negligible string-attachment offset from the centerline.</w:t>
       </w:r>
     </w:p>
     <w:p>
@@ -11389,69 +11465,75 @@
         <w:tc>
           <w:tcPr>
             <w:tcW w:type="dxa" w:w="1728"/>
-          </w:tcPr>
-          <w:p>
-            <w:r/>
-            <w:r>
-              <w:rPr>
-                <w:sz w:val="19"/>
-              </w:rPr>
-              <w:t>CP, from nose tip</w:t>
+            <w:shd w:val="clear" w:color="auto" w:fill="F2F6F8"/>
+          </w:tcPr>
+          <w:p>
+            <w:r/>
+            <w:r>
+              <w:rPr>
+                <w:sz w:val="19"/>
+              </w:rPr>
+              <w:t xml:space="preserve">Total length</w:t>
             </w:r>
           </w:p>
         </w:tc>
         <w:tc>
           <w:tcPr>
             <w:tcW w:type="dxa" w:w="1728"/>
-          </w:tcPr>
-          <w:p>
-            <w:r/>
-            <w:r>
-              <w:rPr>
-                <w:sz w:val="19"/>
-              </w:rPr>
-              <w:t>361.006 mm (36.1 cm)</w:t>
+            <w:shd w:val="clear" w:color="auto" w:fill="F2F6F8"/>
+          </w:tcPr>
+          <w:p>
+            <w:r/>
+            <w:r>
+              <w:rPr>
+                <w:sz w:val="19"/>
+              </w:rPr>
+              <w:t xml:space="preserve">750 mm (75.0 cm)</w:t>
             </w:r>
           </w:p>
         </w:tc>
         <w:tc>
           <w:tcPr>
             <w:tcW w:type="dxa" w:w="1728"/>
-          </w:tcPr>
-          <w:p>
-            <w:r/>
-            <w:r>
-              <w:rPr>
-                <w:sz w:val="19"/>
-              </w:rPr>
-              <w:t>Fusion 360 planform projection (13.2.1); origin measured 656.139 mm from nose, nose-to-tail = 640.678 mm</w:t>
+            <w:shd w:val="clear" w:color="auto" w:fill="F2F6F8"/>
+          </w:tcPr>
+          <w:p>
+            <w:r/>
+            <w:r>
+              <w:rPr>
+                <w:sz w:val="19"/>
+              </w:rPr>
+              <w:t xml:space="preserve">Direct measurement</w:t>
             </w:r>
           </w:p>
         </w:tc>
         <w:tc>
           <w:tcPr>
             <w:tcW w:type="dxa" w:w="1728"/>
-          </w:tcPr>
-          <w:p>
-            <w:r/>
-            <w:r>
-              <w:rPr>
-                <w:sz w:val="19"/>
-              </w:rPr>
-              <w:t>2026-08-10</w:t>
+            <w:shd w:val="clear" w:color="auto" w:fill="F2F6F8"/>
+          </w:tcPr>
+          <w:p>
+            <w:r/>
+            <w:r>
+              <w:rPr>
+                <w:sz w:val="19"/>
+              </w:rPr>
+              <w:t xml:space="preserve">2026-09-18</w:t>
             </w:r>
           </w:p>
         </w:tc>
         <w:tc>
           <w:tcPr>
             <w:tcW w:type="dxa" w:w="1728"/>
-          </w:tcPr>
-          <w:p>
-            <w:r/>
-            <w:r>
-              <w:rPr>
-                <w:sz w:val="19"/>
-              </w:rPr>
+            <w:shd w:val="clear" w:color="auto" w:fill="F2F6F8"/>
+          </w:tcPr>
+          <w:p>
+            <w:r/>
+            <w:r>
+              <w:rPr>
+                <w:sz w:val="19"/>
+              </w:rPr>
+              <w:t xml:space="preserve">Nose tip to tail</w:t>
             </w:r>
           </w:p>
         </w:tc>
@@ -11468,7 +11550,7 @@
               <w:rPr>
                 <w:sz w:val="19"/>
               </w:rPr>
-              <w:t>CP, from tail</w:t>
+              <w:t xml:space="preserve">Body diameter</w:t>
             </w:r>
           </w:p>
         </w:tc>
@@ -11483,7 +11565,7 @@
               <w:rPr>
                 <w:sz w:val="19"/>
               </w:rPr>
-              <w:t>279.672 mm (28.0 cm)</w:t>
+              <w:t xml:space="preserve">66 mm (6.6 cm)</w:t>
             </w:r>
           </w:p>
         </w:tc>
@@ -11498,7 +11580,7 @@
               <w:rPr>
                 <w:sz w:val="19"/>
               </w:rPr>
-              <w:t>Same measurement, opposite reference</w:t>
+              <w:t xml:space="preserve">Direct measurement</w:t>
             </w:r>
           </w:p>
         </w:tc>
@@ -11513,7 +11595,7 @@
               <w:rPr>
                 <w:sz w:val="19"/>
               </w:rPr>
-              <w:t>2026-08-10</w:t>
+              <w:t xml:space="preserve">2026-09-18</w:t>
             </w:r>
           </w:p>
         </w:tc>
@@ -11528,6 +11610,7 @@
               <w:rPr>
                 <w:sz w:val="19"/>
               </w:rPr>
+              <w:t xml:space="preserve">Reference diameter for aero coefficients and caliber calcs</w:t>
             </w:r>
           </w:p>
         </w:tc>
@@ -11543,7 +11626,7 @@
               <w:rPr>
                 <w:sz w:val="19"/>
               </w:rPr>
-              <w:t>CG (no motor)</w:t>
+              <w:t>CP, from nose tip</w:t>
             </w:r>
           </w:p>
         </w:tc>
@@ -11557,7 +11640,7 @@
               <w:rPr>
                 <w:sz w:val="19"/>
               </w:rPr>
-              <w:t>NOT YET MEASURED</w:t>
+              <w:t>361.006 mm (36.1 cm)</w:t>
             </w:r>
           </w:p>
         </w:tc>
@@ -11571,7 +11654,7 @@
               <w:rPr>
                 <w:sz w:val="19"/>
               </w:rPr>
-              <w:t>Balance test</w:t>
+              <w:t>Fusion 360 planform projection (13.2.1); origin measured 656.139 mm from nose, nose-to-tail = 640.678 mm</w:t>
             </w:r>
           </w:p>
         </w:tc>
@@ -11585,7 +11668,7 @@
               <w:rPr>
                 <w:sz w:val="19"/>
               </w:rPr>
-              <w:t>-</w:t>
+              <w:t>2026-08-10</w:t>
             </w:r>
           </w:p>
         </w:tc>
@@ -11599,7 +11682,6 @@
               <w:rPr>
                 <w:sz w:val="19"/>
               </w:rPr>
-              <w:t>Needed before computing stability margin</w:t>
             </w:r>
           </w:p>
         </w:tc>
@@ -11616,7 +11698,7 @@
               <w:rPr>
                 <w:sz w:val="19"/>
               </w:rPr>
-              <w:t>CG (loaded)</w:t>
+              <w:t>CP, from tail</w:t>
             </w:r>
           </w:p>
         </w:tc>
@@ -11631,7 +11713,7 @@
               <w:rPr>
                 <w:sz w:val="19"/>
               </w:rPr>
-              <w:t>NOT YET MEASURED</w:t>
+              <w:t>279.672 mm (28.0 cm)</w:t>
             </w:r>
           </w:p>
         </w:tc>
@@ -11646,7 +11728,7 @@
               <w:rPr>
                 <w:sz w:val="19"/>
               </w:rPr>
-              <w:t>Balance test, per motor</w:t>
+              <w:t>Same measurement, opposite reference</w:t>
             </w:r>
           </w:p>
         </w:tc>
@@ -11661,7 +11743,7 @@
               <w:rPr>
                 <w:sz w:val="19"/>
               </w:rPr>
-              <w:t>-</w:t>
+              <w:t>2026-08-10</w:t>
             </w:r>
           </w:p>
         </w:tc>
@@ -11684,70 +11766,75 @@
         <w:tc>
           <w:tcPr>
             <w:tcW w:type="dxa" w:w="1728"/>
-          </w:tcPr>
-          <w:p>
-            <w:r/>
-            <w:r>
-              <w:rPr>
-                <w:sz w:val="19"/>
-              </w:rPr>
-              <w:t>Total mass</w:t>
+            <w:shd w:val="clear" w:color="auto" w:fill="F2F6F8"/>
+          </w:tcPr>
+          <w:p>
+            <w:r/>
+            <w:r>
+              <w:rPr>
+                <w:sz w:val="19"/>
+              </w:rPr>
+              <w:t xml:space="preserve">CP, from nose tip (OpenRocket)</w:t>
             </w:r>
           </w:p>
         </w:tc>
         <w:tc>
           <w:tcPr>
             <w:tcW w:type="dxa" w:w="1728"/>
-          </w:tcPr>
-          <w:p>
-            <w:r/>
-            <w:r>
-              <w:rPr>
-                <w:sz w:val="19"/>
-              </w:rPr>
-              <w:t>NOT YET MEASURED</w:t>
+            <w:shd w:val="clear" w:color="auto" w:fill="F2F6F8"/>
+          </w:tcPr>
+          <w:p>
+            <w:r/>
+            <w:r>
+              <w:rPr>
+                <w:sz w:val="19"/>
+              </w:rPr>
+              <w:t xml:space="preserve">478 mm (47.8 cm)</w:t>
             </w:r>
           </w:p>
         </w:tc>
         <w:tc>
           <w:tcPr>
             <w:tcW w:type="dxa" w:w="1728"/>
-          </w:tcPr>
-          <w:p>
-            <w:r/>
-            <w:r>
-              <w:rPr>
-                <w:sz w:val="19"/>
-              </w:rPr>
-              <w:t>Bench scale</w:t>
+            <w:shd w:val="clear" w:color="auto" w:fill="F2F6F8"/>
+          </w:tcPr>
+          <w:p>
+            <w:r/>
+            <w:r>
+              <w:rPr>
+                <w:sz w:val="19"/>
+              </w:rPr>
+              <w:t xml:space="preserve">OpenRocket simulation (Barrowman method)</w:t>
             </w:r>
           </w:p>
         </w:tc>
         <w:tc>
           <w:tcPr>
             <w:tcW w:type="dxa" w:w="1728"/>
-          </w:tcPr>
-          <w:p>
-            <w:r/>
-            <w:r>
-              <w:rPr>
-                <w:sz w:val="19"/>
-              </w:rPr>
-              <w:t>-</w:t>
+            <w:shd w:val="clear" w:color="auto" w:fill="F2F6F8"/>
+          </w:tcPr>
+          <w:p>
+            <w:r/>
+            <w:r>
+              <w:rPr>
+                <w:sz w:val="19"/>
+              </w:rPr>
+              <w:t xml:space="preserve">2026-09-18</w:t>
             </w:r>
           </w:p>
         </w:tc>
         <w:tc>
           <w:tcPr>
             <w:tcW w:type="dxa" w:w="1728"/>
-          </w:tcPr>
-          <w:p>
-            <w:r/>
-            <w:r>
-              <w:rPr>
-                <w:sz w:val="19"/>
-              </w:rPr>
-              <w:t>The 354.106 g Fusion figure is the flat proxy body, not the real rocket</w:t>
+            <w:shd w:val="clear" w:color="auto" w:fill="F2F6F8"/>
+          </w:tcPr>
+          <w:p>
+            <w:r/>
+            <w:r>
+              <w:rPr>
+                <w:sz w:val="19"/>
+              </w:rPr>
+              <w:t xml:space="preserve">Cross-check per Open Items (13.5); disagrees with the CAD flat-plate estimate above by ~11.7 cm. Stability margin below uses this value.</w:t>
             </w:r>
           </w:p>
         </w:tc>
@@ -11756,18 +11843,75 @@
         <w:tc>
           <w:tcPr>
             <w:tcW w:type="dxa" w:w="1728"/>
-            <w:shd w:val="clear" w:color="auto" w:fill="F2F6F8"/>
-          </w:tcPr>
-          <w:p>
-            <w:r/>
-            <w:r>
-              <w:rPr>
-                <w:sz w:val="19"/>
-              </w:rPr>
-              <w:t>Stability margin</w:t>
-            </w:r>
-          </w:p>
-        </w:tc>
+          </w:tcPr>
+          <w:p>
+            <w:r/>
+            <w:r>
+              <w:rPr>
+                <w:sz w:val="19"/>
+              </w:rPr>
+              <w:t>CG (no motor)</w:t>
+            </w:r>
+          </w:p>
+        </w:tc>
+        <w:tc>
+          <w:tcPr>
+            <w:tcW w:type="dxa" w:w="1728"/>
+          </w:tcPr>
+          <w:p>
+            <w:r/>
+            <w:r>
+              <w:rPr>
+                <w:sz w:val="19"/>
+              </w:rPr>
+              <w:t>NOT YET MEASURED</w:t>
+            </w:r>
+          </w:p>
+        </w:tc>
+        <w:tc>
+          <w:tcPr>
+            <w:tcW w:type="dxa" w:w="1728"/>
+          </w:tcPr>
+          <w:p>
+            <w:r/>
+            <w:r>
+              <w:rPr>
+                <w:sz w:val="19"/>
+              </w:rPr>
+              <w:t>Balance test</w:t>
+            </w:r>
+          </w:p>
+        </w:tc>
+        <w:tc>
+          <w:tcPr>
+            <w:tcW w:type="dxa" w:w="1728"/>
+          </w:tcPr>
+          <w:p>
+            <w:r/>
+            <w:r>
+              <w:rPr>
+                <w:sz w:val="19"/>
+              </w:rPr>
+              <w:t>-</w:t>
+            </w:r>
+          </w:p>
+        </w:tc>
+        <w:tc>
+          <w:tcPr>
+            <w:tcW w:type="dxa" w:w="1728"/>
+          </w:tcPr>
+          <w:p>
+            <w:r/>
+            <w:r>
+              <w:rPr>
+                <w:sz w:val="19"/>
+              </w:rPr>
+              <w:t>Needed before computing stability margin</w:t>
+            </w:r>
+          </w:p>
+        </w:tc>
+      </w:tr>
+      <w:tr>
         <w:tc>
           <w:tcPr>
             <w:tcW w:type="dxa" w:w="1728"/>
@@ -11779,7 +11923,7 @@
               <w:rPr>
                 <w:sz w:val="19"/>
               </w:rPr>
-              <w:t>NOT YET COMPUTABLE</w:t>
+              <w:t xml:space="preserve">CG (loaded)</w:t>
             </w:r>
           </w:p>
         </w:tc>
@@ -11794,7 +11938,7 @@
               <w:rPr>
                 <w:sz w:val="19"/>
               </w:rPr>
-              <w:t>(CP-CG)/diameter</w:t>
+              <w:t xml:space="preserve">390 mm (39.0 cm)</w:t>
             </w:r>
           </w:p>
         </w:tc>
@@ -11809,7 +11953,7 @@
               <w:rPr>
                 <w:sz w:val="19"/>
               </w:rPr>
-              <w:t>-</w:t>
+              <w:t xml:space="preserve">Balance test, per motor</w:t>
             </w:r>
           </w:p>
         </w:tc>
@@ -11824,7 +11968,613 @@
               <w:rPr>
                 <w:sz w:val="19"/>
               </w:rPr>
-              <w:t>Blocked on CG</w:t>
+              <w:t xml:space="preserve">2026-09-18</w:t>
+            </w:r>
+          </w:p>
+        </w:tc>
+        <w:tc>
+          <w:tcPr>
+            <w:tcW w:type="dxa" w:w="1728"/>
+            <w:shd w:val="clear" w:color="auto" w:fill="F2F6F8"/>
+          </w:tcPr>
+          <w:p>
+            <w:r/>
+            <w:r>
+              <w:rPr>
+                <w:sz w:val="19"/>
+              </w:rPr>
+              <w:t xml:space="preserve">Motor installed (liftoff mass config)</w:t>
+            </w:r>
+          </w:p>
+        </w:tc>
+      </w:tr>
+      <w:tr>
+        <w:tc>
+          <w:tcPr>
+            <w:tcW w:type="dxa" w:w="1728"/>
+          </w:tcPr>
+          <w:p>
+            <w:r/>
+            <w:r>
+              <w:rPr>
+                <w:sz w:val="19"/>
+              </w:rPr>
+              <w:t xml:space="preserve">Total mass (loaded)</w:t>
+            </w:r>
+          </w:p>
+        </w:tc>
+        <w:tc>
+          <w:tcPr>
+            <w:tcW w:type="dxa" w:w="1728"/>
+          </w:tcPr>
+          <w:p>
+            <w:r/>
+            <w:r>
+              <w:rPr>
+                <w:sz w:val="19"/>
+              </w:rPr>
+              <w:t xml:space="preserve">743 g (0.743 kg)</w:t>
+            </w:r>
+          </w:p>
+        </w:tc>
+        <w:tc>
+          <w:tcPr>
+            <w:tcW w:type="dxa" w:w="1728"/>
+          </w:tcPr>
+          <w:p>
+            <w:r/>
+            <w:r>
+              <w:rPr>
+                <w:sz w:val="19"/>
+              </w:rPr>
+              <w:t xml:space="preserve">Bench scale</w:t>
+            </w:r>
+          </w:p>
+        </w:tc>
+        <w:tc>
+          <w:tcPr>
+            <w:tcW w:type="dxa" w:w="1728"/>
+          </w:tcPr>
+          <w:p>
+            <w:r/>
+            <w:r>
+              <w:rPr>
+                <w:sz w:val="19"/>
+              </w:rPr>
+              <w:t xml:space="preserve">2026-09-18</w:t>
+            </w:r>
+          </w:p>
+        </w:tc>
+        <w:tc>
+          <w:tcPr>
+            <w:tcW w:type="dxa" w:w="1728"/>
+          </w:tcPr>
+          <w:p>
+            <w:r/>
+            <w:r>
+              <w:rPr>
+                <w:sz w:val="19"/>
+              </w:rPr>
+              <w:t xml:space="preserve">Liftoff mass, live motor installed. The 354.106 g Fusion figure is the flat proxy body, not this value.</w:t>
+            </w:r>
+          </w:p>
+        </w:tc>
+      </w:tr>
+      <w:tr>
+        <w:tc>
+          <w:tcPr>
+            <w:tcW w:type="dxa" w:w="1728"/>
+          </w:tcPr>
+          <w:p>
+            <w:r/>
+            <w:r>
+              <w:rPr>
+                <w:sz w:val="19"/>
+              </w:rPr>
+              <w:t xml:space="preserve">Mass, no motor</w:t>
+            </w:r>
+          </w:p>
+        </w:tc>
+        <w:tc>
+          <w:tcPr>
+            <w:tcW w:type="dxa" w:w="1728"/>
+          </w:tcPr>
+          <w:p>
+            <w:r/>
+            <w:r>
+              <w:rPr>
+                <w:sz w:val="19"/>
+              </w:rPr>
+              <w:t xml:space="preserve">656 g (0.656 kg)</w:t>
+            </w:r>
+          </w:p>
+        </w:tc>
+        <w:tc>
+          <w:tcPr>
+            <w:tcW w:type="dxa" w:w="1728"/>
+          </w:tcPr>
+          <w:p>
+            <w:r/>
+            <w:r>
+              <w:rPr>
+                <w:sz w:val="19"/>
+              </w:rPr>
+              <w:t xml:space="preserve">Bench scale</w:t>
+            </w:r>
+          </w:p>
+        </w:tc>
+        <w:tc>
+          <w:tcPr>
+            <w:tcW w:type="dxa" w:w="1728"/>
+          </w:tcPr>
+          <w:p>
+            <w:r/>
+            <w:r>
+              <w:rPr>
+                <w:sz w:val="19"/>
+              </w:rPr>
+              <w:t xml:space="preserve">2026-09-18</w:t>
+            </w:r>
+          </w:p>
+        </w:tc>
+        <w:tc>
+          <w:tcPr>
+            <w:tcW w:type="dxa" w:w="1728"/>
+          </w:tcPr>
+          <w:p>
+            <w:r/>
+            <w:r>
+              <w:rPr>
+                <w:sz w:val="19"/>
+              </w:rPr>
+              <w:t xml:space="preserve">BENCH REFERENCE ONLY, not a flight state -- the rocket never flies without a motor</w:t>
+            </w:r>
+          </w:p>
+        </w:tc>
+      </w:tr>
+      <w:tr>
+        <w:tc>
+          <w:tcPr>
+            <w:tcW w:type="dxa" w:w="1728"/>
+          </w:tcPr>
+          <w:p>
+            <w:r/>
+            <w:r>
+              <w:rPr>
+                <w:sz w:val="19"/>
+              </w:rPr>
+              <w:t xml:space="preserve">Motor mass (propellant + casing)</w:t>
+            </w:r>
+          </w:p>
+        </w:tc>
+        <w:tc>
+          <w:tcPr>
+            <w:tcW w:type="dxa" w:w="1728"/>
+          </w:tcPr>
+          <w:p>
+            <w:r/>
+            <w:r>
+              <w:rPr>
+                <w:sz w:val="19"/>
+              </w:rPr>
+              <w:t xml:space="preserve">87 g</w:t>
+            </w:r>
+          </w:p>
+        </w:tc>
+        <w:tc>
+          <w:tcPr>
+            <w:tcW w:type="dxa" w:w="1728"/>
+          </w:tcPr>
+          <w:p>
+            <w:r/>
+            <w:r>
+              <w:rPr>
+                <w:sz w:val="19"/>
+              </w:rPr>
+              <w:t xml:space="preserve">Computed (loaded - no-motor)</w:t>
+            </w:r>
+          </w:p>
+        </w:tc>
+        <w:tc>
+          <w:tcPr>
+            <w:tcW w:type="dxa" w:w="1728"/>
+          </w:tcPr>
+          <w:p>
+            <w:r/>
+            <w:r>
+              <w:rPr>
+                <w:sz w:val="19"/>
+              </w:rPr>
+              <w:t xml:space="preserve">2026-09-18</w:t>
+            </w:r>
+          </w:p>
+        </w:tc>
+        <w:tc>
+          <w:tcPr>
+            <w:tcW w:type="dxa" w:w="1728"/>
+          </w:tcPr>
+          <w:p>
+            <w:r/>
+            <w:r>
+              <w:rPr>
+                <w:sz w:val="19"/>
+              </w:rPr>
+              <w:t xml:space="preserve">Includes the spent casing -- NOT propellant mass alone. Motor is single-use; casing stays onboard after burnout.</w:t>
+            </w:r>
+          </w:p>
+        </w:tc>
+      </w:tr>
+      <w:tr>
+        <w:tc>
+          <w:tcPr>
+            <w:tcW w:type="dxa" w:w="1728"/>
+          </w:tcPr>
+          <w:p>
+            <w:r/>
+            <w:r>
+              <w:rPr>
+                <w:sz w:val="19"/>
+              </w:rPr>
+              <w:t xml:space="preserve">Propellant mass</w:t>
+            </w:r>
+          </w:p>
+        </w:tc>
+        <w:tc>
+          <w:tcPr>
+            <w:tcW w:type="dxa" w:w="1728"/>
+          </w:tcPr>
+          <w:p>
+            <w:r/>
+            <w:r>
+              <w:rPr>
+                <w:sz w:val="19"/>
+              </w:rPr>
+              <w:t xml:space="preserve">TODO -- pending motor spec sheet</w:t>
+            </w:r>
+          </w:p>
+        </w:tc>
+        <w:tc>
+          <w:tcPr>
+            <w:tcW w:type="dxa" w:w="1728"/>
+          </w:tcPr>
+          <w:p>
+            <w:r/>
+            <w:r>
+              <w:rPr>
+                <w:sz w:val="19"/>
+              </w:rPr>
+              <w:t xml:space="preserve">Motor manufacturer spec (thrustcurve.org)</w:t>
+            </w:r>
+          </w:p>
+        </w:tc>
+        <w:tc>
+          <w:tcPr>
+            <w:tcW w:type="dxa" w:w="1728"/>
+          </w:tcPr>
+          <w:p>
+            <w:r/>
+            <w:r>
+              <w:rPr>
+                <w:sz w:val="19"/>
+              </w:rPr>
+              <w:t xml:space="preserve">-</w:t>
+            </w:r>
+          </w:p>
+        </w:tc>
+        <w:tc>
+          <w:tcPr>
+            <w:tcW w:type="dxa" w:w="1728"/>
+          </w:tcPr>
+          <w:p>
+            <w:r/>
+            <w:r>
+              <w:rPr>
+                <w:sz w:val="19"/>
+              </w:rPr>
+              <w:t xml:space="preserve">Needed for the mass model, 13.4. Will be less than the 87 g motor mass above (casing excluded).</w:t>
+            </w:r>
+          </w:p>
+        </w:tc>
+      </w:tr>
+      <w:tr>
+        <w:tc>
+          <w:tcPr>
+            <w:tcW w:type="dxa" w:w="1728"/>
+          </w:tcPr>
+          <w:p>
+            <w:r/>
+            <w:r>
+              <w:rPr>
+                <w:sz w:val="19"/>
+              </w:rPr>
+              <w:t xml:space="preserve">Mass at burnout</w:t>
+            </w:r>
+          </w:p>
+        </w:tc>
+        <w:tc>
+          <w:tcPr>
+            <w:tcW w:type="dxa" w:w="1728"/>
+          </w:tcPr>
+          <w:p>
+            <w:r/>
+            <w:r>
+              <w:rPr>
+                <w:sz w:val="19"/>
+              </w:rPr>
+              <w:t xml:space="preserve">TODO = 743 g - propellant mass</w:t>
+            </w:r>
+          </w:p>
+        </w:tc>
+        <w:tc>
+          <w:tcPr>
+            <w:tcW w:type="dxa" w:w="1728"/>
+          </w:tcPr>
+          <w:p>
+            <w:r/>
+            <w:r>
+              <w:rPr>
+                <w:sz w:val="19"/>
+              </w:rPr>
+              <w:t xml:space="preserve">Computed, pending propellant mass</w:t>
+            </w:r>
+          </w:p>
+        </w:tc>
+        <w:tc>
+          <w:tcPr>
+            <w:tcW w:type="dxa" w:w="1728"/>
+          </w:tcPr>
+          <w:p>
+            <w:r/>
+            <w:r>
+              <w:rPr>
+                <w:sz w:val="19"/>
+              </w:rPr>
+              <w:t xml:space="preserve">-</w:t>
+            </w:r>
+          </w:p>
+        </w:tc>
+        <w:tc>
+          <w:tcPr>
+            <w:tcW w:type="dxa" w:w="1728"/>
+          </w:tcPr>
+          <w:p>
+            <w:r/>
+            <w:r>
+              <w:rPr>
+                <w:sz w:val="19"/>
+              </w:rPr>
+              <w:t xml:space="preserve">Spent casing remains onboard -- burnout mass is NOT the 656 g no-motor reference</w:t>
+            </w:r>
+          </w:p>
+        </w:tc>
+      </w:tr>
+      <w:tr>
+        <w:tc>
+          <w:tcPr>
+            <w:tcW w:type="dxa" w:w="1728"/>
+            <w:shd w:val="clear" w:color="auto" w:fill="F2F6F8"/>
+          </w:tcPr>
+          <w:p>
+            <w:r/>
+            <w:r>
+              <w:rPr>
+                <w:sz w:val="19"/>
+              </w:rPr>
+              <w:t xml:space="preserve">Radius of gyration, pitch/yaw (loaded)</w:t>
+            </w:r>
+          </w:p>
+        </w:tc>
+        <w:tc>
+          <w:tcPr>
+            <w:tcW w:type="dxa" w:w="1728"/>
+            <w:shd w:val="clear" w:color="auto" w:fill="F2F6F8"/>
+          </w:tcPr>
+          <w:p>
+            <w:r/>
+            <w:r>
+              <w:rPr>
+                <w:sz w:val="19"/>
+              </w:rPr>
+              <w:t xml:space="preserve">0.213 m</w:t>
+            </w:r>
+          </w:p>
+        </w:tc>
+        <w:tc>
+          <w:tcPr>
+            <w:tcW w:type="dxa" w:w="1728"/>
+            <w:shd w:val="clear" w:color="auto" w:fill="F2F6F8"/>
+          </w:tcPr>
+          <w:p>
+            <w:r/>
+            <w:r>
+              <w:rPr>
+                <w:sz w:val="19"/>
+              </w:rPr>
+              <w:t xml:space="preserve">Bifilar pendulum, 13.2.2</w:t>
+            </w:r>
+          </w:p>
+        </w:tc>
+        <w:tc>
+          <w:tcPr>
+            <w:tcW w:type="dxa" w:w="1728"/>
+            <w:shd w:val="clear" w:color="auto" w:fill="F2F6F8"/>
+          </w:tcPr>
+          <w:p>
+            <w:r/>
+            <w:r>
+              <w:rPr>
+                <w:sz w:val="19"/>
+              </w:rPr>
+              <w:t xml:space="preserve">2026-09-18</w:t>
+            </w:r>
+          </w:p>
+        </w:tc>
+        <w:tc>
+          <w:tcPr>
+            <w:tcW w:type="dxa" w:w="1728"/>
+            <w:shd w:val="clear" w:color="auto" w:fill="F2F6F8"/>
+          </w:tcPr>
+          <w:p>
+            <w:r/>
+            <w:r>
+              <w:rPr>
+                <w:sz w:val="19"/>
+              </w:rPr>
+              <w:t xml:space="preserve">Uniform-rod check predicts 0.217 m for this length; measured value sits just below</w:t>
+            </w:r>
+          </w:p>
+        </w:tc>
+      </w:tr>
+      <w:tr>
+        <w:tc>
+          <w:tcPr>
+            <w:tcW w:type="dxa" w:w="1728"/>
+            <w:shd w:val="clear" w:color="auto" w:fill="F2F6F8"/>
+          </w:tcPr>
+          <w:p>
+            <w:r/>
+            <w:r>
+              <w:rPr>
+                <w:sz w:val="19"/>
+              </w:rPr>
+              <w:t xml:space="preserve">Moment of inertia, pitch/yaw (loaded)</w:t>
+            </w:r>
+          </w:p>
+        </w:tc>
+        <w:tc>
+          <w:tcPr>
+            <w:tcW w:type="dxa" w:w="1728"/>
+            <w:shd w:val="clear" w:color="auto" w:fill="F2F6F8"/>
+          </w:tcPr>
+          <w:p>
+            <w:r/>
+            <w:r>
+              <w:rPr>
+                <w:sz w:val="19"/>
+              </w:rPr>
+              <w:t xml:space="preserve">0.0338 kg*m^2</w:t>
+            </w:r>
+          </w:p>
+        </w:tc>
+        <w:tc>
+          <w:tcPr>
+            <w:tcW w:type="dxa" w:w="1728"/>
+            <w:shd w:val="clear" w:color="auto" w:fill="F2F6F8"/>
+          </w:tcPr>
+          <w:p>
+            <w:r/>
+            <w:r>
+              <w:rPr>
+                <w:sz w:val="19"/>
+              </w:rPr>
+              <w:t xml:space="preserve">Bifilar pendulum, I = m*k^2, 13.2.2</w:t>
+            </w:r>
+          </w:p>
+        </w:tc>
+        <w:tc>
+          <w:tcPr>
+            <w:tcW w:type="dxa" w:w="1728"/>
+            <w:shd w:val="clear" w:color="auto" w:fill="F2F6F8"/>
+          </w:tcPr>
+          <w:p>
+            <w:r/>
+            <w:r>
+              <w:rPr>
+                <w:sz w:val="19"/>
+              </w:rPr>
+              <w:t xml:space="preserve">2026-09-18</w:t>
+            </w:r>
+          </w:p>
+        </w:tc>
+        <w:tc>
+          <w:tcPr>
+            <w:tcW w:type="dxa" w:w="1728"/>
+            <w:shd w:val="clear" w:color="auto" w:fill="F2F6F8"/>
+          </w:tcPr>
+          <w:p>
+            <w:r/>
+            <w:r>
+              <w:rPr>
+                <w:sz w:val="19"/>
+              </w:rPr>
+              <w:t xml:space="preserve">Held CONSTANT for the full simulated flight -- see 13.4 for justification and the required robustness test</w:t>
+            </w:r>
+          </w:p>
+        </w:tc>
+      </w:tr>
+      <w:tr>
+        <w:tc>
+          <w:tcPr>
+            <w:tcW w:type="dxa" w:w="1728"/>
+            <w:shd w:val="clear" w:color="auto" w:fill="F2F6F8"/>
+          </w:tcPr>
+          <w:p>
+            <w:r/>
+            <w:r>
+              <w:rPr>
+                <w:sz w:val="19"/>
+              </w:rPr>
+              <w:t xml:space="preserve">Stability margin</w:t>
+            </w:r>
+          </w:p>
+        </w:tc>
+        <w:tc>
+          <w:tcPr>
+            <w:tcW w:type="dxa" w:w="1728"/>
+            <w:shd w:val="clear" w:color="auto" w:fill="F2F6F8"/>
+          </w:tcPr>
+          <w:p>
+            <w:r/>
+            <w:r>
+              <w:rPr>
+                <w:sz w:val="19"/>
+              </w:rPr>
+              <w:t xml:space="preserve">1.33 calibers</w:t>
+            </w:r>
+          </w:p>
+        </w:tc>
+        <w:tc>
+          <w:tcPr>
+            <w:tcW w:type="dxa" w:w="1728"/>
+            <w:shd w:val="clear" w:color="auto" w:fill="F2F6F8"/>
+          </w:tcPr>
+          <w:p>
+            <w:r/>
+            <w:r>
+              <w:rPr>
+                <w:sz w:val="19"/>
+              </w:rPr>
+              <w:t xml:space="preserve">(CP-CG)/diameter, using OpenRocket CP</w:t>
+            </w:r>
+          </w:p>
+        </w:tc>
+        <w:tc>
+          <w:tcPr>
+            <w:tcW w:type="dxa" w:w="1728"/>
+            <w:shd w:val="clear" w:color="auto" w:fill="F2F6F8"/>
+          </w:tcPr>
+          <w:p>
+            <w:r/>
+            <w:r>
+              <w:rPr>
+                <w:sz w:val="19"/>
+              </w:rPr>
+              <w:t xml:space="preserve">2026-09-18</w:t>
+            </w:r>
+          </w:p>
+        </w:tc>
+        <w:tc>
+          <w:tcPr>
+            <w:tcW w:type="dxa" w:w="1728"/>
+            <w:shd w:val="clear" w:color="auto" w:fill="F2F6F8"/>
+          </w:tcPr>
+          <w:p>
+            <w:r/>
+            <w:r>
+              <w:rPr>
+                <w:sz w:val="19"/>
+              </w:rPr>
+              <w:t xml:space="preserve">= (47.8-39.0)/6.6, using the OpenRocket CP above. CAUTION: the CAD flat-plate CP (36.1 cm) instead gives a NEGATIVE margin (CP forward of CG) -- the two CP estimates disagree on stability itself, not just the number. See 13.5, unresolved.</w:t>
             </w:r>
           </w:p>
         </w:tc>
@@ -11836,7 +12586,42 @@
         <w:pStyle w:val="Heading2"/>
       </w:pPr>
       <w:r>
-        <w:t>13.4 Open Items</w:t>
+        <w:t xml:space="preserve">13.4 Modeling Assumptions and Limitations</w:t>
+      </w:r>
+    </w:p>
+    <w:p>
+      <w:r>
+        <w:rPr>
+          <w:b w:val="0"/>
+          <w:i w:val="0"/>
+        </w:rPr>
+        <w:t xml:space="preserve">The simulation holds pitch/yaw inertia FIXED at the loaded value (I = 0.0338 kg*m^2) for the entire flight rather than varying it over the burn. Deliberate simplification, not an oversight: only propellant leaves during flight (the casing stays onboard), so true inertia drops modestly from ignition to burnout, and the controller model is slightly optimistic near burnout as a result. REQUIRED before trusting this assumption: a robustness test perturbing pitch inertia by +-25% (deliberately conservative vs. the expected real variation) confirming the control loop stays stable -- no sustained oscillation or excessive overshoot. Not yet performed, see 13.5. If a burnout-configuration inertia is measured later, prefer a mid-burn average over the loaded value.</w:t>
+      </w:r>
+    </w:p>
+    <w:p>
+      <w:r>
+        <w:rPr>
+          <w:b w:val="0"/>
+          <w:i w:val="0"/>
+        </w:rPr>
+        <w:t xml:space="preserve">Mass and CG are NOT frozen -- both should vary over the burn per the motor thrust curve, interpolating from 743 g at ignition down to the burnout mass (743 g minus propellant mass, once supplied -- NOT down to the 656 g no-motor reference). Cheap to include and directly affects F=ma and static margin.</w:t>
+      </w:r>
+    </w:p>
+    <w:p>
+      <w:r>
+        <w:rPr>
+          <w:b w:val="0"/>
+          <w:i w:val="0"/>
+        </w:rPr>
+        <w:t xml:space="preserve">All values in 13.3 are tied to the CURRENT motor. A motor change moves CG (changing static margin -- currently 1.33 cal, but a heavier motor could push it below 1 cal), changes loaded inertia, and changes the thrust curve entirely. Action item: re-measure CG and re-run the loaded bifilar pendulum test with any new motor before trusting the sim.</w:t>
+      </w:r>
+    </w:p>
+    <w:p>
+      <w:pPr>
+        <w:pStyle w:val="Heading2"/>
+      </w:pPr>
+      <w:r>
+        <w:t xml:space="preserve">13.5 Open Items</w:t>
       </w:r>
     </w:p>
     <w:p>
@@ -11844,7 +12629,7 @@
         <w:pStyle w:val="ListNumber"/>
       </w:pPr>
       <w:r>
-        <w:t>CG not yet measured for any configuration</w:t>
+        <w:t xml:space="preserve">CP estimates disagree on the stability conclusion itself, not just the number: the CAD flat-plate estimate (36.1 cm) implies CP forward of CG (unstable); the OpenRocket/Barrowman estimate (47.8 cm) implies 1.33 cal (stable). Unresolved -- see 13.3/13.4.</w:t>
       </w:r>
     </w:p>
     <w:p>
@@ -11852,7 +12637,7 @@
         <w:pStyle w:val="ListNumber"/>
       </w:pPr>
       <w:r>
-        <w:t>Fusion's Steel/mass/inertia output describes the flat CP-estimation proxy, not the real rocket -- do not reuse it as an actual mass budget</w:t>
+        <w:t xml:space="preserve">Propellant mass and burnout mass are TODO placeholders pending the motor spec sheet (thrustcurve.org) -- needed for the mass model, 13.4</w:t>
       </w:r>
     </w:p>
     <w:p>
@@ -11860,7 +12645,47 @@
         <w:pStyle w:val="ListNumber"/>
       </w:pPr>
       <w:r>
-        <w:t>Cross-check the flat-plate CP estimate against Barrowman/OpenRocket/RASAero before finalizing stability margin</w:t>
+        <w:t xml:space="preserve">+-25% pitch-inertia robustness test REQUIRED before trusting the constant-inertia assumption -- not yet performed, see 13.4</w:t>
+      </w:r>
+    </w:p>
+    <w:p>
+      <w:pPr>
+        <w:pStyle w:val="ListNumber"/>
+      </w:pPr>
+      <w:r>
+        <w:t xml:space="preserve">CG (no motor, bench reference) not yet measured -- CG (loaded) now recorded, 13.3</w:t>
+      </w:r>
+    </w:p>
+    <w:p>
+      <w:pPr>
+        <w:pStyle w:val="ListNumber"/>
+      </w:pPr>
+      <w:r>
+        <w:t xml:space="preserve">Fusion's Steel/mass/inertia output describes the flat CP-estimation proxy, not the real rocket -- do not reuse it as an actual mass budget</w:t>
+      </w:r>
+    </w:p>
+    <w:p>
+      <w:pPr>
+        <w:pStyle w:val="ListNumber"/>
+      </w:pPr>
+      <w:r>
+        <w:t xml:space="preserve">Burnout-configuration pitch/yaw inertia -- optional under the constant-inertia assumption; can only be measured after a flight (single-use motor, needs a spent casing). Do NOT scale the loaded k^2 by a different mass -- must be measured.</w:t>
+      </w:r>
+    </w:p>
+    <w:p>
+      <w:pPr>
+        <w:pStyle w:val="ListNumber"/>
+      </w:pPr>
+      <w:r>
+        <w:t xml:space="preserve">Roll-axis inertia (loaded, and later burnout) -- not yet measured; hang nose-up, use the widest string spacing practical</w:t>
+      </w:r>
+    </w:p>
+    <w:p>
+      <w:pPr>
+        <w:pStyle w:val="ListNumber"/>
+      </w:pPr>
+      <w:r>
+        <w:t xml:space="preserve">If the motor changes: re-measure CG and re-run the loaded bifilar pendulum test with the new motor before trusting the sim -- see 13.4</w:t>
       </w:r>
     </w:p>
     <w:p>

</xml_diff>